<commit_message>
Auto commit (2026-10-14 17:01) — 4 changes
Claude Code 세션 종료 시 자동 커밋.

Co-Authored-By: Claude <noreply@anthropic.com>
</commit_message>
<xml_diff>
--- a/projects/36_slave_dragon_king/노예라 불린 용의 공주_작가 전달_1-8화 검토와 이후 방향_v3.docx
+++ b/projects/36_slave_dragon_king/노예라 불린 용의 공주_작가 전달_1-8화 검토와 이후 방향_v3.docx
@@ -35,18 +35,6 @@
           <w:b w:val="0"/>
         </w:rPr>
         <w:t>여왕 이름이 원작 여왕 이름과 같습니다. 엘레노어(Eleanor)로 바꿔 주세요.</w:t>
-      </w:r>
-    </w:p>
-    <w:p>
-      <w:pPr>
-        <w:pStyle w:val="ListBullet"/>
-      </w:pPr>
-      <w:r>
-        <w:rPr>
-          <w:rFonts w:ascii="Malgun Gothic" w:hAnsi="Malgun Gothic" w:eastAsia="Malgun Gothic"/>
-          <w:b w:val="0"/>
-        </w:rPr>
-        <w:t>5화 에드워드의 "어머니……"를 속마음이 아니라 혼잣말로 해 주세요. 바로 뒤에 바네사가 듣습니다.</w:t>
       </w:r>
     </w:p>
     <w:p>

</xml_diff>